<commit_message>
ADJUNTADO TODO Y ZIP PARA ENTREGAR
terminamos
</commit_message>
<xml_diff>
--- a/MEMORIA ISO 2.docx
+++ b/MEMORIA ISO 2.docx
@@ -703,7 +703,23 @@
           <w:b/>
           <w:sz w:val="28"/>
         </w:rPr>
-        <w:t>Daniel Zamora Hector Zapatero David</w:t>
+        <w:t xml:space="preserve">Daniel Zamora </w:t>
+      </w:r>
+      <w:proofErr w:type="spellStart"/>
+      <w:r>
+        <w:rPr>
+          <w:b/>
+          <w:sz w:val="28"/>
+        </w:rPr>
+        <w:t>Hector</w:t>
+      </w:r>
+      <w:proofErr w:type="spellEnd"/>
+      <w:r>
+        <w:rPr>
+          <w:b/>
+          <w:sz w:val="28"/>
+        </w:rPr>
+        <w:t xml:space="preserve"> Zapatero David</w:t>
       </w:r>
       <w:r>
         <w:rPr>
@@ -2758,7 +2774,15 @@
         <w:jc w:val="both"/>
       </w:pPr>
       <w:r>
-        <w:t>La empresa Mega Cell nos pide la realización de un software relacionado con la compra y control de un catálogo de videojuegos a través de una app robusta y dinámica. Dentro de esta aplicación podrán existir diferentes tipos de usuarios como, usuarios registrados y no registrados además de los propios desarrolladores de videojuegos quienes controlan el catálogo. Los videojuegos como tal tienen un precio base, pero se les deberá de realizar un descuento los findes de semana y cualquier usuario registrado puede realizar la compra de un videojuego que queda registrado en su biblioteca personal, desde donde puede descargar los títulos, aunque la descarga del ya no es de nuestra competencia.</w:t>
+        <w:t xml:space="preserve">La empresa Mega Cell nos pide la realización de un software relacionado con la compra y control de un catálogo de videojuegos a través de una </w:t>
+      </w:r>
+      <w:proofErr w:type="gramStart"/>
+      <w:r>
+        <w:t>app</w:t>
+      </w:r>
+      <w:proofErr w:type="gramEnd"/>
+      <w:r>
+        <w:t xml:space="preserve"> robusta y dinámica. Dentro de esta aplicación podrán existir diferentes tipos de usuarios como, usuarios registrados y no registrados además de los propios desarrolladores de videojuegos quienes controlan el catálogo. Los videojuegos como tal tienen un precio base, pero se les deberá de realizar un descuento los findes de semana y cualquier usuario registrado puede realizar la compra de un videojuego que queda registrado en su biblioteca personal, desde donde puede descargar los títulos, aunque la descarga del ya no es de nuestra competencia.</w:t>
       </w:r>
     </w:p>
     <w:p>
@@ -8487,6 +8511,7 @@
                 <w:lang w:val="es-ES"/>
               </w:rPr>
             </w:pPr>
+            <w:proofErr w:type="gramStart"/>
             <w:r>
               <w:rPr>
                 <w:w w:val="110"/>
@@ -8546,6 +8571,7 @@
               </w:rPr>
               <w:t>desarrollar</w:t>
             </w:r>
+            <w:proofErr w:type="gramEnd"/>
             <w:r>
               <w:rPr>
                 <w:spacing w:val="-4"/>
@@ -24495,6 +24521,7 @@
               </w:rPr>
               <w:tab/>
             </w:r>
+            <w:proofErr w:type="gramStart"/>
             <w:r>
               <w:rPr>
                 <w:spacing w:val="-2"/>
@@ -24518,7 +24545,17 @@
                 <w:sz w:val="20"/>
                 <w:lang w:val="es-ES"/>
               </w:rPr>
-              <w:t xml:space="preserve">R.F.013.Iniciar </w:t>
+              <w:t>R.F.013.Iniciar</w:t>
+            </w:r>
+            <w:proofErr w:type="gramEnd"/>
+            <w:r>
+              <w:rPr>
+                <w:spacing w:val="-4"/>
+                <w:w w:val="110"/>
+                <w:sz w:val="20"/>
+                <w:lang w:val="es-ES"/>
+              </w:rPr>
+              <w:t xml:space="preserve"> </w:t>
             </w:r>
             <w:r>
               <w:rPr>
@@ -38992,7 +39029,25 @@
                 <w:sz w:val="20"/>
                 <w:lang w:val="es-ES"/>
               </w:rPr>
-              <w:t xml:space="preserve">de la plataforma por motivos como obsolescencia o malware, </w:t>
+              <w:t xml:space="preserve">de la plataforma por motivos como obsolescencia o </w:t>
+            </w:r>
+            <w:proofErr w:type="gramStart"/>
+            <w:r>
+              <w:rPr>
+                <w:w w:val="110"/>
+                <w:sz w:val="20"/>
+                <w:lang w:val="es-ES"/>
+              </w:rPr>
+              <w:t>malware</w:t>
+            </w:r>
+            <w:proofErr w:type="gramEnd"/>
+            <w:r>
+              <w:rPr>
+                <w:w w:val="110"/>
+                <w:sz w:val="20"/>
+                <w:lang w:val="es-ES"/>
+              </w:rPr>
+              <w:t xml:space="preserve">, </w:t>
             </w:r>
             <w:r>
               <w:rPr>
@@ -50677,7 +50732,7 @@
           <w:noProof/>
         </w:rPr>
         <w:drawing>
-          <wp:anchor distT="0" distB="0" distL="114300" distR="114300" simplePos="0" relativeHeight="251706368" behindDoc="0" locked="0" layoutInCell="1" allowOverlap="1" wp14:anchorId="5194DC65" wp14:editId="3BB528B2">
+          <wp:anchor distT="0" distB="0" distL="114300" distR="114300" simplePos="0" relativeHeight="251706368" behindDoc="0" locked="0" layoutInCell="1" allowOverlap="1" wp14:anchorId="5194DC65" wp14:editId="3378B3B3">
             <wp:simplePos x="0" y="0"/>
             <wp:positionH relativeFrom="margin">
               <wp:align>center</wp:align>
@@ -50890,7 +50945,7 @@
           <w:noProof/>
         </w:rPr>
         <w:drawing>
-          <wp:anchor distT="0" distB="0" distL="114300" distR="114300" simplePos="0" relativeHeight="251708416" behindDoc="0" locked="0" layoutInCell="1" allowOverlap="1" wp14:anchorId="3D7A402C" wp14:editId="48D5589C">
+          <wp:anchor distT="0" distB="0" distL="114300" distR="114300" simplePos="0" relativeHeight="251708416" behindDoc="0" locked="0" layoutInCell="1" allowOverlap="1" wp14:anchorId="3D7A402C" wp14:editId="1FCA6B07">
             <wp:simplePos x="0" y="0"/>
             <wp:positionH relativeFrom="margin">
               <wp:align>center</wp:align>
@@ -50992,7 +51047,7 @@
           <w:noProof/>
         </w:rPr>
         <w:drawing>
-          <wp:anchor distT="0" distB="0" distL="114300" distR="114300" simplePos="0" relativeHeight="251709440" behindDoc="0" locked="0" layoutInCell="1" allowOverlap="1" wp14:anchorId="03783E48" wp14:editId="2ADBAF00">
+          <wp:anchor distT="0" distB="0" distL="114300" distR="114300" simplePos="0" relativeHeight="251709440" behindDoc="0" locked="0" layoutInCell="1" allowOverlap="1" wp14:anchorId="03783E48" wp14:editId="6923DC61">
             <wp:simplePos x="0" y="0"/>
             <wp:positionH relativeFrom="margin">
               <wp:align>center</wp:align>
@@ -51095,7 +51150,7 @@
           <w:noProof/>
         </w:rPr>
         <w:drawing>
-          <wp:anchor distT="0" distB="0" distL="114300" distR="114300" simplePos="0" relativeHeight="251710464" behindDoc="0" locked="0" layoutInCell="1" allowOverlap="1" wp14:anchorId="33C1F9D1" wp14:editId="359EDEF2">
+          <wp:anchor distT="0" distB="0" distL="114300" distR="114300" simplePos="0" relativeHeight="251710464" behindDoc="0" locked="0" layoutInCell="1" allowOverlap="1" wp14:anchorId="33C1F9D1" wp14:editId="47783206">
             <wp:simplePos x="0" y="0"/>
             <wp:positionH relativeFrom="margin">
               <wp:align>center</wp:align>
@@ -51192,7 +51247,7 @@
         </w:rPr>
         <w:lastRenderedPageBreak/>
         <w:drawing>
-          <wp:anchor distT="0" distB="0" distL="114300" distR="114300" simplePos="0" relativeHeight="251711488" behindDoc="0" locked="0" layoutInCell="1" allowOverlap="1" wp14:anchorId="2C392EDF" wp14:editId="265C1503">
+          <wp:anchor distT="0" distB="0" distL="114300" distR="114300" simplePos="0" relativeHeight="251711488" behindDoc="0" locked="0" layoutInCell="1" allowOverlap="1" wp14:anchorId="2C392EDF" wp14:editId="653543D5">
             <wp:simplePos x="0" y="0"/>
             <wp:positionH relativeFrom="margin">
               <wp:align>center</wp:align>
@@ -51281,15 +51336,90 @@
     <w:p/>
     <w:p/>
     <w:p/>
-    <w:p/>
-    <w:p/>
+    <w:p>
+      <w:pPr>
+        <w:sectPr>
+          <w:pgSz w:w="16838" w:h="11906" w:orient="landscape"/>
+          <w:pgMar w:top="1701" w:right="1417" w:bottom="1701" w:left="1417" w:header="708" w:footer="708" w:gutter="0"/>
+          <w:cols w:space="708"/>
+          <w:docGrid w:linePitch="360"/>
+        </w:sectPr>
+      </w:pPr>
+    </w:p>
     <w:p>
       <w:pPr>
         <w:pStyle w:val="Ttulo3"/>
       </w:pPr>
       <w:bookmarkStart w:id="82" w:name="_Toc229905715"/>
       <w:r>
+        <w:rPr>
+          <w:noProof/>
+        </w:rPr>
         <w:lastRenderedPageBreak/>
+        <w:drawing>
+          <wp:anchor distT="0" distB="0" distL="114300" distR="114300" simplePos="0" relativeHeight="251718656" behindDoc="0" locked="0" layoutInCell="1" allowOverlap="1" wp14:anchorId="7934B157" wp14:editId="4FF42B7D">
+            <wp:simplePos x="0" y="0"/>
+            <wp:positionH relativeFrom="column">
+              <wp:posOffset>-670560</wp:posOffset>
+            </wp:positionH>
+            <wp:positionV relativeFrom="paragraph">
+              <wp:posOffset>357505</wp:posOffset>
+            </wp:positionV>
+            <wp:extent cx="7052310" cy="8162925"/>
+            <wp:effectExtent l="0" t="0" r="0" b="9525"/>
+            <wp:wrapSquare wrapText="bothSides"/>
+            <wp:docPr id="1010154587" name="Imagen 5"/>
+            <wp:cNvGraphicFramePr>
+              <a:graphicFrameLocks xmlns:a="http://schemas.openxmlformats.org/drawingml/2006/main" noChangeAspect="1"/>
+            </wp:cNvGraphicFramePr>
+            <a:graphic xmlns:a="http://schemas.openxmlformats.org/drawingml/2006/main">
+              <a:graphicData uri="http://schemas.openxmlformats.org/drawingml/2006/picture">
+                <pic:pic xmlns:pic="http://schemas.openxmlformats.org/drawingml/2006/picture">
+                  <pic:nvPicPr>
+                    <pic:cNvPr id="0" name="Picture 1"/>
+                    <pic:cNvPicPr>
+                      <a:picLocks noChangeAspect="1" noChangeArrowheads="1"/>
+                    </pic:cNvPicPr>
+                  </pic:nvPicPr>
+                  <pic:blipFill>
+                    <a:blip r:embed="rId41">
+                      <a:extLst>
+                        <a:ext uri="{28A0092B-C50C-407E-A947-70E740481C1C}">
+                          <a14:useLocalDpi xmlns:a14="http://schemas.microsoft.com/office/drawing/2010/main" val="0"/>
+                        </a:ext>
+                      </a:extLst>
+                    </a:blip>
+                    <a:srcRect/>
+                    <a:stretch>
+                      <a:fillRect/>
+                    </a:stretch>
+                  </pic:blipFill>
+                  <pic:spPr bwMode="auto">
+                    <a:xfrm>
+                      <a:off x="0" y="0"/>
+                      <a:ext cx="7052310" cy="8162925"/>
+                    </a:xfrm>
+                    <a:prstGeom prst="rect">
+                      <a:avLst/>
+                    </a:prstGeom>
+                    <a:noFill/>
+                    <a:ln>
+                      <a:noFill/>
+                    </a:ln>
+                  </pic:spPr>
+                </pic:pic>
+              </a:graphicData>
+            </a:graphic>
+            <wp14:sizeRelH relativeFrom="margin">
+              <wp14:pctWidth>0</wp14:pctWidth>
+            </wp14:sizeRelH>
+            <wp14:sizeRelV relativeFrom="margin">
+              <wp14:pctHeight>0</wp14:pctHeight>
+            </wp14:sizeRelV>
+          </wp:anchor>
+        </w:drawing>
+      </w:r>
+      <w:r>
         <w:t>CU.011</w:t>
       </w:r>
       <w:bookmarkEnd w:id="82"/>
@@ -51301,8 +51431,8 @@
         <w:autoSpaceDN/>
         <w:spacing w:after="160" w:line="278" w:lineRule="auto"/>
         <w:sectPr>
-          <w:pgSz w:w="16838" w:h="11906" w:orient="landscape"/>
-          <w:pgMar w:top="1701" w:right="1417" w:bottom="1701" w:left="1417" w:header="708" w:footer="708" w:gutter="0"/>
+          <w:pgSz w:w="11906" w:h="16838"/>
+          <w:pgMar w:top="1417" w:right="1701" w:bottom="1417" w:left="1701" w:header="708" w:footer="708" w:gutter="0"/>
           <w:cols w:space="708"/>
           <w:docGrid w:linePitch="360"/>
         </w:sectPr>
@@ -51350,7 +51480,7 @@
                     </pic:cNvPicPr>
                   </pic:nvPicPr>
                   <pic:blipFill>
-                    <a:blip r:embed="rId41">
+                    <a:blip r:embed="rId42">
                       <a:extLst>
                         <a:ext uri="{28A0092B-C50C-407E-A947-70E740481C1C}">
                           <a14:useLocalDpi xmlns:a14="http://schemas.microsoft.com/office/drawing/2010/main" val="0"/>
@@ -51443,7 +51573,7 @@
                     </pic:cNvPicPr>
                   </pic:nvPicPr>
                   <pic:blipFill>
-                    <a:blip r:embed="rId42">
+                    <a:blip r:embed="rId43">
                       <a:extLst>
                         <a:ext uri="{28A0092B-C50C-407E-A947-70E740481C1C}">
                           <a14:useLocalDpi xmlns:a14="http://schemas.microsoft.com/office/drawing/2010/main" val="0"/>
@@ -51520,7 +51650,7 @@
                     </pic:cNvPicPr>
                   </pic:nvPicPr>
                   <pic:blipFill>
-                    <a:blip r:embed="rId43">
+                    <a:blip r:embed="rId44">
                       <a:extLst>
                         <a:ext uri="{28A0092B-C50C-407E-A947-70E740481C1C}">
                           <a14:useLocalDpi xmlns:a14="http://schemas.microsoft.com/office/drawing/2010/main" val="0"/>
@@ -51619,7 +51749,7 @@
                     </pic:cNvPicPr>
                   </pic:nvPicPr>
                   <pic:blipFill>
-                    <a:blip r:embed="rId44">
+                    <a:blip r:embed="rId45">
                       <a:extLst>
                         <a:ext uri="{28A0092B-C50C-407E-A947-70E740481C1C}">
                           <a14:useLocalDpi xmlns:a14="http://schemas.microsoft.com/office/drawing/2010/main" val="0"/>
@@ -51730,7 +51860,7 @@
                     </pic:cNvPicPr>
                   </pic:nvPicPr>
                   <pic:blipFill>
-                    <a:blip r:embed="rId45">
+                    <a:blip r:embed="rId46">
                       <a:extLst>
                         <a:ext uri="{28A0092B-C50C-407E-A947-70E740481C1C}">
                           <a14:useLocalDpi xmlns:a14="http://schemas.microsoft.com/office/drawing/2010/main" val="0"/>
@@ -51820,7 +51950,7 @@
                     </pic:cNvPicPr>
                   </pic:nvPicPr>
                   <pic:blipFill>
-                    <a:blip r:embed="rId46">
+                    <a:blip r:embed="rId47">
                       <a:extLst>
                         <a:ext uri="{28A0092B-C50C-407E-A947-70E740481C1C}">
                           <a14:useLocalDpi xmlns:a14="http://schemas.microsoft.com/office/drawing/2010/main" val="0"/>
@@ -51931,7 +52061,7 @@
                     </pic:cNvPicPr>
                   </pic:nvPicPr>
                   <pic:blipFill>
-                    <a:blip r:embed="rId47">
+                    <a:blip r:embed="rId48">
                       <a:extLst>
                         <a:ext uri="{28A0092B-C50C-407E-A947-70E740481C1C}">
                           <a14:useLocalDpi xmlns:a14="http://schemas.microsoft.com/office/drawing/2010/main" val="0"/>
@@ -51999,7 +52129,7 @@
                     </pic:cNvPicPr>
                   </pic:nvPicPr>
                   <pic:blipFill>
-                    <a:blip r:embed="rId48">
+                    <a:blip r:embed="rId49">
                       <a:extLst>
                         <a:ext uri="{28A0092B-C50C-407E-A947-70E740481C1C}">
                           <a14:useLocalDpi xmlns:a14="http://schemas.microsoft.com/office/drawing/2010/main" val="0"/>
@@ -52069,7 +52199,7 @@
                     </pic:cNvPicPr>
                   </pic:nvPicPr>
                   <pic:blipFill>
-                    <a:blip r:embed="rId49">
+                    <a:blip r:embed="rId50">
                       <a:extLst>
                         <a:ext uri="{28A0092B-C50C-407E-A947-70E740481C1C}">
                           <a14:useLocalDpi xmlns:a14="http://schemas.microsoft.com/office/drawing/2010/main" val="0"/>
@@ -52143,6 +52273,7 @@
       <w:pPr>
         <w:spacing w:before="200" w:after="120"/>
       </w:pPr>
+      <w:proofErr w:type="gramStart"/>
       <w:r>
         <w:rPr>
           <w:b/>
@@ -52150,7 +52281,17 @@
           <w:sz w:val="24"/>
           <w:szCs w:val="24"/>
         </w:rPr>
-        <w:t>Funcionalidad a implementar:</w:t>
+        <w:t>Funcionalidad a implementar</w:t>
+      </w:r>
+      <w:proofErr w:type="gramEnd"/>
+      <w:r>
+        <w:rPr>
+          <w:b/>
+          <w:bCs/>
+          <w:sz w:val="24"/>
+          <w:szCs w:val="24"/>
+        </w:rPr>
+        <w:t>:</w:t>
       </w:r>
     </w:p>
     <w:p>
@@ -52512,6 +52653,7 @@
       <w:pPr>
         <w:spacing w:before="200" w:after="120"/>
       </w:pPr>
+      <w:proofErr w:type="gramStart"/>
       <w:r>
         <w:rPr>
           <w:b/>
@@ -52519,7 +52661,17 @@
           <w:sz w:val="24"/>
           <w:szCs w:val="24"/>
         </w:rPr>
-        <w:t>Funcionalidad a implementar:</w:t>
+        <w:t>Funcionalidad a implementar</w:t>
+      </w:r>
+      <w:proofErr w:type="gramEnd"/>
+      <w:r>
+        <w:rPr>
+          <w:b/>
+          <w:bCs/>
+          <w:sz w:val="24"/>
+          <w:szCs w:val="24"/>
+        </w:rPr>
+        <w:t>:</w:t>
       </w:r>
     </w:p>
     <w:p>
@@ -52700,6 +52852,7 @@
       <w:pPr>
         <w:spacing w:before="200" w:after="120"/>
       </w:pPr>
+      <w:proofErr w:type="gramStart"/>
       <w:r>
         <w:rPr>
           <w:b/>
@@ -52707,7 +52860,17 @@
           <w:sz w:val="24"/>
           <w:szCs w:val="24"/>
         </w:rPr>
-        <w:t>Funcionalidad a implementar:</w:t>
+        <w:t>Funcionalidad a implementar</w:t>
+      </w:r>
+      <w:proofErr w:type="gramEnd"/>
+      <w:r>
+        <w:rPr>
+          <w:b/>
+          <w:bCs/>
+          <w:sz w:val="24"/>
+          <w:szCs w:val="24"/>
+        </w:rPr>
+        <w:t>:</w:t>
       </w:r>
     </w:p>
     <w:p>
@@ -52938,6 +53101,7 @@
       <w:pPr>
         <w:spacing w:before="200" w:after="120"/>
       </w:pPr>
+      <w:proofErr w:type="gramStart"/>
       <w:r>
         <w:rPr>
           <w:b/>
@@ -52945,7 +53109,17 @@
           <w:sz w:val="24"/>
           <w:szCs w:val="24"/>
         </w:rPr>
-        <w:t>Funcionalidad a implementar:</w:t>
+        <w:t>Funcionalidad a implementar</w:t>
+      </w:r>
+      <w:proofErr w:type="gramEnd"/>
+      <w:r>
+        <w:rPr>
+          <w:b/>
+          <w:bCs/>
+          <w:sz w:val="24"/>
+          <w:szCs w:val="24"/>
+        </w:rPr>
+        <w:t>:</w:t>
       </w:r>
     </w:p>
     <w:p>
@@ -53269,6 +53443,7 @@
       <w:pPr>
         <w:spacing w:before="200" w:after="120"/>
       </w:pPr>
+      <w:proofErr w:type="gramStart"/>
       <w:r>
         <w:rPr>
           <w:b/>
@@ -53276,7 +53451,17 @@
           <w:sz w:val="24"/>
           <w:szCs w:val="24"/>
         </w:rPr>
-        <w:t>Funcionalidad a implementar:</w:t>
+        <w:t>Funcionalidad a implementar</w:t>
+      </w:r>
+      <w:proofErr w:type="gramEnd"/>
+      <w:r>
+        <w:rPr>
+          <w:b/>
+          <w:bCs/>
+          <w:sz w:val="24"/>
+          <w:szCs w:val="24"/>
+        </w:rPr>
+        <w:t>:</w:t>
       </w:r>
     </w:p>
     <w:p>
@@ -56342,9 +56527,11 @@
         </w:rPr>
         <w:t xml:space="preserve">Contraseña: </w:t>
       </w:r>
+      <w:proofErr w:type="gramStart"/>
       <w:r>
         <w:t>Password123!</w:t>
       </w:r>
+      <w:proofErr w:type="gramEnd"/>
     </w:p>
     <w:p>
       <w:pPr>
@@ -56499,6 +56686,7 @@
         <w:spacing w:after="60"/>
         <w:contextualSpacing w:val="0"/>
       </w:pPr>
+      <w:proofErr w:type="gramStart"/>
       <w:r>
         <w:rPr>
           <w:b/>
@@ -56507,7 +56695,11 @@
         <w:t xml:space="preserve">Contraseña: </w:t>
       </w:r>
       <w:r>
-        <w:t>…..</w:t>
+        <w:t>….</w:t>
+      </w:r>
+      <w:proofErr w:type="gramEnd"/>
+      <w:r>
+        <w:t>.</w:t>
       </w:r>
     </w:p>
     <w:p>
@@ -56583,7 +56775,15 @@
         <w:contextualSpacing w:val="0"/>
       </w:pPr>
       <w:r>
-        <w:t>El usuario existe en el sistema pero la contraseña introducida no coincide con la almacenada.</w:t>
+        <w:t xml:space="preserve">El usuario existe en el </w:t>
+      </w:r>
+      <w:proofErr w:type="gramStart"/>
+      <w:r>
+        <w:t>sistema</w:t>
+      </w:r>
+      <w:proofErr w:type="gramEnd"/>
+      <w:r>
+        <w:t xml:space="preserve"> pero la contraseña introducida no coincide con la almacenada.</w:t>
       </w:r>
     </w:p>
     <w:p>
@@ -57012,9 +57212,11 @@
         </w:rPr>
         <w:t xml:space="preserve">Contraseña: </w:t>
       </w:r>
+      <w:proofErr w:type="gramStart"/>
       <w:r>
         <w:t>Pass1234!</w:t>
       </w:r>
+      <w:proofErr w:type="gramEnd"/>
     </w:p>
     <w:p>
       <w:pPr>
@@ -57355,9 +57557,14 @@
       </w:r>
       <w:proofErr w:type="spellStart"/>
       <w:r>
-        <w:t>usuario@dominio.extensión</w:t>
+        <w:t>usuario@</w:t>
+      </w:r>
+      <w:proofErr w:type="gramStart"/>
+      <w:r>
+        <w:t>dominio.extensión</w:t>
       </w:r>
       <w:proofErr w:type="spellEnd"/>
+      <w:proofErr w:type="gramEnd"/>
       <w:r>
         <w:t>).</w:t>
       </w:r>
@@ -58227,9 +58434,11 @@
         </w:rPr>
         <w:t xml:space="preserve">Contraseña: </w:t>
       </w:r>
+      <w:proofErr w:type="gramStart"/>
       <w:r>
         <w:t>DevPass123!</w:t>
       </w:r>
+      <w:proofErr w:type="gramEnd"/>
     </w:p>
     <w:p>
       <w:pPr>
@@ -58413,9 +58622,11 @@
         </w:rPr>
         <w:t xml:space="preserve">Contraseña: </w:t>
       </w:r>
+      <w:proofErr w:type="gramStart"/>
       <w:r>
         <w:t>DevPass123!</w:t>
       </w:r>
+      <w:proofErr w:type="gramEnd"/>
     </w:p>
     <w:p>
       <w:pPr>
@@ -59473,7 +59684,7 @@
     </w:p>
     <w:p/>
     <w:p>
-      <w:hyperlink r:id="rId50" w:history="1">
+      <w:hyperlink r:id="rId51" w:history="1">
         <w:r>
           <w:rPr>
             <w:rStyle w:val="Hipervnculo"/>

</xml_diff>